<commit_message>
quality check for the dataco data
</commit_message>
<xml_diff>
--- a/dataco_supplychain/dataco_sc_documentation/dataco_report.docx
+++ b/dataco_supplychain/dataco_sc_documentation/dataco_report.docx
@@ -5,6 +5,7 @@
     <w:p>
       <w:pPr>
         <w:pStyle w:val="Title"/>
+        <w:spacing w:line="480" w:lineRule="auto"/>
         <w:rPr>
           <w:rFonts w:ascii="Ink Journal" w:hAnsi="Ink Journal"/>
           <w:b/>
@@ -29,25 +30,27 @@
     <w:p>
       <w:pPr>
         <w:pStyle w:val="Heading1"/>
+        <w:spacing w:line="480" w:lineRule="auto"/>
         <w:rPr>
           <w:rFonts w:ascii="Ink Journal" w:hAnsi="Ink Journal"/>
           <w:color w:val="47D459" w:themeColor="accent3" w:themeTint="99"/>
-          <w:sz w:val="22"/>
-          <w:szCs w:val="22"/>
+          <w:sz w:val="24"/>
+          <w:szCs w:val="24"/>
         </w:rPr>
       </w:pPr>
       <w:r>
         <w:rPr>
           <w:rFonts w:ascii="Ink Journal" w:hAnsi="Ink Journal"/>
           <w:color w:val="47D459" w:themeColor="accent3" w:themeTint="99"/>
-          <w:sz w:val="22"/>
-          <w:szCs w:val="22"/>
+          <w:sz w:val="24"/>
+          <w:szCs w:val="24"/>
         </w:rPr>
         <w:t>Issues identified from data inspection in excel</w:t>
       </w:r>
     </w:p>
     <w:p>
       <w:pPr>
+        <w:spacing w:line="480" w:lineRule="auto"/>
         <w:jc w:val="both"/>
       </w:pPr>
     </w:p>
@@ -58,12 +61,11 @@
           <w:ilvl w:val="0"/>
           <w:numId w:val="4"/>
         </w:numPr>
-      </w:pPr>
-      <w:r>
-        <w:rPr>
-          <w:rFonts w:ascii="Ink Journal" w:hAnsi="Ink Journal"/>
-          <w:sz w:val="22"/>
-          <w:szCs w:val="22"/>
+        <w:spacing w:line="480" w:lineRule="auto"/>
+      </w:pPr>
+      <w:r>
+        <w:rPr>
+          <w:rFonts w:ascii="Ink Journal" w:hAnsi="Ink Journal"/>
         </w:rPr>
         <w:t>Some rows in customer state are numeric values.</w:t>
       </w:r>
@@ -75,88 +77,41 @@
           <w:ilvl w:val="0"/>
           <w:numId w:val="4"/>
         </w:numPr>
+        <w:spacing w:line="480" w:lineRule="auto"/>
         <w:ind w:left="700"/>
         <w:rPr>
           <w:rFonts w:ascii="Ink Journal" w:hAnsi="Ink Journal"/>
-          <w:sz w:val="22"/>
-          <w:szCs w:val="22"/>
-        </w:rPr>
-      </w:pPr>
-      <w:r>
-        <w:rPr>
-          <w:rFonts w:ascii="Ink Journal" w:hAnsi="Ink Journal"/>
-          <w:sz w:val="22"/>
-          <w:szCs w:val="22"/>
+        </w:rPr>
+      </w:pPr>
+      <w:r>
+        <w:rPr>
+          <w:rFonts w:ascii="Ink Journal" w:hAnsi="Ink Journal"/>
         </w:rPr>
         <w:t>Order city</w:t>
       </w:r>
       <w:r>
         <w:rPr>
           <w:rFonts w:ascii="Ink Journal" w:hAnsi="Ink Journal"/>
-          <w:sz w:val="22"/>
-          <w:szCs w:val="22"/>
         </w:rPr>
         <w:t>, order country, order state</w:t>
       </w:r>
       <w:r>
         <w:rPr>
           <w:rFonts w:ascii="Ink Journal" w:hAnsi="Ink Journal"/>
-          <w:sz w:val="22"/>
-          <w:szCs w:val="22"/>
-        </w:rPr>
-        <w:t xml:space="preserve"> column has values with symbols inside the </w:t>
-      </w:r>
-      <w:proofErr w:type="gramStart"/>
-      <w:r>
-        <w:rPr>
-          <w:rFonts w:ascii="Ink Journal" w:hAnsi="Ink Journal"/>
-          <w:sz w:val="22"/>
-          <w:szCs w:val="22"/>
-        </w:rPr>
-        <w:t>word.</w:t>
-      </w:r>
-      <w:r>
-        <w:rPr>
-          <w:rFonts w:ascii="Ink Journal" w:hAnsi="Ink Journal"/>
-          <w:sz w:val="22"/>
-          <w:szCs w:val="22"/>
-        </w:rPr>
-        <w:t>(</w:t>
-      </w:r>
-      <w:proofErr w:type="spellStart"/>
-      <w:proofErr w:type="gramEnd"/>
-      <w:r>
-        <w:rPr>
-          <w:rFonts w:ascii="Ink Journal" w:hAnsi="Ink Journal"/>
-          <w:sz w:val="22"/>
-          <w:szCs w:val="22"/>
-        </w:rPr>
-        <w:t>egs</w:t>
-      </w:r>
-      <w:proofErr w:type="spellEnd"/>
-      <w:r>
-        <w:rPr>
-          <w:rFonts w:ascii="Ink Journal" w:hAnsi="Ink Journal"/>
-          <w:sz w:val="22"/>
-          <w:szCs w:val="22"/>
-        </w:rPr>
-        <w:t xml:space="preserve"> </w:t>
-      </w:r>
-      <w:r>
-        <w:rPr>
-          <w:rFonts w:ascii="Ink Journal" w:hAnsi="Ink Journal"/>
-          <w:sz w:val="22"/>
-          <w:szCs w:val="22"/>
-        </w:rPr>
-        <w:t>Cï¿½lebes Septentrional</w:t>
-      </w:r>
-      <w:r>
-        <w:rPr>
-          <w:rFonts w:ascii="Ink Journal" w:hAnsi="Ink Journal"/>
-          <w:sz w:val="22"/>
-          <w:szCs w:val="22"/>
-        </w:rPr>
-        <w:t>)</w:t>
+        </w:rPr>
+        <w:t xml:space="preserve"> column has values with symbols inside the word.</w:t>
+      </w:r>
+      <w:r>
+        <w:rPr>
+          <w:rFonts w:ascii="Ink Journal" w:hAnsi="Ink Journal"/>
+        </w:rPr>
+        <w:t xml:space="preserve">(egs </w:t>
+      </w:r>
+      <w:r>
+        <w:rPr>
+          <w:rFonts w:ascii="Ink Journal" w:hAnsi="Ink Journal"/>
+        </w:rPr>
+        <w:t>Cï¿½lebes Septentrional)</w:t>
       </w:r>
     </w:p>
     <w:p>
@@ -166,13 +121,12 @@
           <w:ilvl w:val="0"/>
           <w:numId w:val="4"/>
         </w:numPr>
+        <w:spacing w:line="480" w:lineRule="auto"/>
         <w:ind w:left="700"/>
       </w:pPr>
       <w:r>
         <w:rPr>
           <w:rFonts w:ascii="Ink Journal" w:hAnsi="Ink Journal"/>
-          <w:sz w:val="22"/>
-          <w:szCs w:val="22"/>
         </w:rPr>
         <w:t>The whole product description column is blank</w:t>
       </w:r>
@@ -184,13 +138,12 @@
           <w:ilvl w:val="0"/>
           <w:numId w:val="4"/>
         </w:numPr>
+        <w:spacing w:line="480" w:lineRule="auto"/>
         <w:ind w:left="700"/>
       </w:pPr>
       <w:r>
         <w:rPr>
           <w:rFonts w:ascii="Ink Journal" w:hAnsi="Ink Journal"/>
-          <w:sz w:val="22"/>
-          <w:szCs w:val="22"/>
         </w:rPr>
         <w:t>The whole of product status column is zero.</w:t>
       </w:r>
@@ -202,56 +155,23 @@
           <w:ilvl w:val="0"/>
           <w:numId w:val="4"/>
         </w:numPr>
-      </w:pPr>
-      <w:r>
-        <w:rPr>
-          <w:rFonts w:ascii="Ink Journal" w:hAnsi="Ink Journal"/>
-          <w:sz w:val="22"/>
-          <w:szCs w:val="22"/>
-        </w:rPr>
-        <w:t xml:space="preserve">Removed the </w:t>
-      </w:r>
-      <w:proofErr w:type="spellStart"/>
-      <w:r>
-        <w:rPr>
-          <w:rFonts w:ascii="Ink Journal" w:hAnsi="Ink Journal"/>
-          <w:sz w:val="22"/>
-          <w:szCs w:val="22"/>
-        </w:rPr>
-        <w:t>customer_password</w:t>
-      </w:r>
-      <w:proofErr w:type="spellEnd"/>
-      <w:r>
-        <w:rPr>
-          <w:rFonts w:ascii="Ink Journal" w:hAnsi="Ink Journal"/>
-          <w:sz w:val="22"/>
-          <w:szCs w:val="22"/>
-        </w:rPr>
-        <w:t xml:space="preserve"> and product image</w:t>
-      </w:r>
-      <w:r>
-        <w:rPr>
-          <w:rFonts w:ascii="Ink Journal" w:hAnsi="Ink Journal"/>
-          <w:sz w:val="22"/>
-          <w:szCs w:val="22"/>
-        </w:rPr>
-        <w:t xml:space="preserve">, </w:t>
-      </w:r>
-      <w:proofErr w:type="spellStart"/>
-      <w:r>
-        <w:rPr>
-          <w:rFonts w:ascii="Ink Journal" w:hAnsi="Ink Journal"/>
-          <w:sz w:val="22"/>
-          <w:szCs w:val="22"/>
-        </w:rPr>
-        <w:t>customer_email</w:t>
-      </w:r>
-      <w:proofErr w:type="spellEnd"/>
-      <w:r>
-        <w:rPr>
-          <w:rFonts w:ascii="Ink Journal" w:hAnsi="Ink Journal"/>
-          <w:sz w:val="22"/>
-          <w:szCs w:val="22"/>
+        <w:spacing w:line="480" w:lineRule="auto"/>
+      </w:pPr>
+      <w:r>
+        <w:rPr>
+          <w:rFonts w:ascii="Ink Journal" w:hAnsi="Ink Journal"/>
+        </w:rPr>
+        <w:t>Removed the customer_password and product image</w:t>
+      </w:r>
+      <w:r>
+        <w:rPr>
+          <w:rFonts w:ascii="Ink Journal" w:hAnsi="Ink Journal"/>
+        </w:rPr>
+        <w:t>, customer_email</w:t>
+      </w:r>
+      <w:r>
+        <w:rPr>
+          <w:rFonts w:ascii="Ink Journal" w:hAnsi="Ink Journal"/>
         </w:rPr>
         <w:t xml:space="preserve"> columns from the raw table.</w:t>
       </w:r>
@@ -263,91 +183,35 @@
           <w:ilvl w:val="0"/>
           <w:numId w:val="4"/>
         </w:numPr>
-        <w:rPr>
-          <w:rFonts w:ascii="Ink Journal" w:hAnsi="Ink Journal"/>
-          <w:sz w:val="22"/>
-          <w:szCs w:val="22"/>
-        </w:rPr>
-      </w:pPr>
-      <w:r>
-        <w:rPr>
-          <w:rFonts w:ascii="Ink Journal" w:hAnsi="Ink Journal"/>
-          <w:sz w:val="22"/>
-          <w:szCs w:val="22"/>
-        </w:rPr>
-        <w:t xml:space="preserve">Create a </w:t>
-      </w:r>
-      <w:proofErr w:type="spellStart"/>
-      <w:r>
-        <w:rPr>
-          <w:rFonts w:ascii="Ink Journal" w:hAnsi="Ink Journal"/>
-          <w:sz w:val="22"/>
-          <w:szCs w:val="22"/>
-        </w:rPr>
-        <w:t>dq_notes</w:t>
-      </w:r>
-      <w:proofErr w:type="spellEnd"/>
-      <w:r>
-        <w:rPr>
-          <w:rFonts w:ascii="Ink Journal" w:hAnsi="Ink Journal"/>
-          <w:sz w:val="22"/>
-          <w:szCs w:val="22"/>
-        </w:rPr>
-        <w:t xml:space="preserve"> column that records the instances of the above issues and bad </w:t>
-      </w:r>
-      <w:proofErr w:type="spellStart"/>
-      <w:r>
-        <w:rPr>
-          <w:rFonts w:ascii="Ink Journal" w:hAnsi="Ink Journal"/>
-          <w:sz w:val="22"/>
-          <w:szCs w:val="22"/>
-        </w:rPr>
-        <w:t>order_id</w:t>
-      </w:r>
-      <w:proofErr w:type="spellEnd"/>
-      <w:r>
-        <w:rPr>
-          <w:rFonts w:ascii="Ink Journal" w:hAnsi="Ink Journal"/>
-          <w:sz w:val="22"/>
-          <w:szCs w:val="22"/>
-        </w:rPr>
-        <w:t xml:space="preserve"> and </w:t>
-      </w:r>
-      <w:proofErr w:type="spellStart"/>
-      <w:r>
-        <w:rPr>
-          <w:rFonts w:ascii="Ink Journal" w:hAnsi="Ink Journal"/>
-          <w:sz w:val="22"/>
-          <w:szCs w:val="22"/>
-        </w:rPr>
-        <w:t>order_item_id</w:t>
-      </w:r>
-      <w:proofErr w:type="spellEnd"/>
-      <w:r>
-        <w:rPr>
-          <w:rFonts w:ascii="Ink Journal" w:hAnsi="Ink Journal"/>
-          <w:sz w:val="22"/>
-          <w:szCs w:val="22"/>
-        </w:rPr>
-        <w:t>.</w:t>
+        <w:spacing w:line="480" w:lineRule="auto"/>
+        <w:rPr>
+          <w:rFonts w:ascii="Ink Journal" w:hAnsi="Ink Journal"/>
+        </w:rPr>
+      </w:pPr>
+      <w:r>
+        <w:rPr>
+          <w:rFonts w:ascii="Ink Journal" w:hAnsi="Ink Journal"/>
+        </w:rPr>
+        <w:t>Create a dq_notes column that records the instances of the above issues and bad order_id and order_item_id.</w:t>
       </w:r>
     </w:p>
     <w:p>
       <w:pPr>
         <w:pStyle w:val="Heading1"/>
+        <w:spacing w:line="480" w:lineRule="auto"/>
         <w:rPr>
           <w:rFonts w:ascii="Ink Journal" w:hAnsi="Ink Journal"/>
           <w:color w:val="47D459" w:themeColor="accent3" w:themeTint="99"/>
-          <w:sz w:val="22"/>
-          <w:szCs w:val="22"/>
+          <w:sz w:val="24"/>
+          <w:szCs w:val="24"/>
         </w:rPr>
       </w:pPr>
       <w:r>
         <w:rPr>
           <w:rFonts w:ascii="Ink Journal" w:hAnsi="Ink Journal"/>
           <w:color w:val="47D459" w:themeColor="accent3" w:themeTint="99"/>
-          <w:sz w:val="22"/>
-          <w:szCs w:val="22"/>
+          <w:sz w:val="24"/>
+          <w:szCs w:val="24"/>
         </w:rPr>
         <w:t>Issues identified in the staging schema.</w:t>
       </w:r>
@@ -359,142 +223,55 @@
           <w:ilvl w:val="0"/>
           <w:numId w:val="5"/>
         </w:numPr>
-      </w:pPr>
-      <w:proofErr w:type="spellStart"/>
-      <w:r>
-        <w:rPr>
-          <w:rFonts w:ascii="Ink Journal" w:hAnsi="Ink Journal"/>
-          <w:sz w:val="22"/>
-          <w:szCs w:val="22"/>
-        </w:rPr>
-        <w:t>Order_country</w:t>
-      </w:r>
-      <w:proofErr w:type="spellEnd"/>
-      <w:r>
-        <w:rPr>
-          <w:rFonts w:ascii="Ink Journal" w:hAnsi="Ink Journal"/>
-          <w:sz w:val="22"/>
-          <w:szCs w:val="22"/>
-        </w:rPr>
-        <w:t xml:space="preserve"> column had mojibake characters, </w:t>
-      </w:r>
-      <w:r>
-        <w:rPr>
-          <w:rFonts w:ascii="Ink Journal" w:hAnsi="Ink Journal"/>
-          <w:sz w:val="22"/>
-          <w:szCs w:val="22"/>
-        </w:rPr>
-        <w:t xml:space="preserve">in </w:t>
-      </w:r>
-      <w:r>
-        <w:rPr>
-          <w:rFonts w:ascii="Ink Journal" w:hAnsi="Ink Journal"/>
-          <w:sz w:val="22"/>
-          <w:szCs w:val="22"/>
-        </w:rPr>
-        <w:t xml:space="preserve">the </w:t>
-      </w:r>
-      <w:r>
-        <w:rPr>
-          <w:rFonts w:ascii="Ink Journal" w:hAnsi="Ink Journal"/>
-          <w:sz w:val="22"/>
-          <w:szCs w:val="22"/>
-        </w:rPr>
-        <w:t xml:space="preserve">staging schema, the loading </w:t>
-      </w:r>
-      <w:r>
-        <w:rPr>
-          <w:rFonts w:ascii="Ink Journal" w:hAnsi="Ink Journal"/>
-          <w:sz w:val="22"/>
-          <w:szCs w:val="22"/>
-        </w:rPr>
-        <w:t>script was edited to correct thi</w:t>
-      </w:r>
-      <w:r>
-        <w:rPr>
-          <w:rFonts w:ascii="Ink Journal" w:hAnsi="Ink Journal"/>
-          <w:sz w:val="22"/>
-          <w:szCs w:val="22"/>
-        </w:rPr>
-        <w:t>s.</w:t>
+        <w:spacing w:line="480" w:lineRule="auto"/>
+      </w:pPr>
+      <w:r>
+        <w:rPr>
+          <w:rFonts w:ascii="Ink Journal" w:hAnsi="Ink Journal"/>
+        </w:rPr>
+        <w:t>Order_country column had mojibake characters, in the staging schema, the loading script was edited to correct</w:t>
+      </w:r>
+      <w:r>
+        <w:rPr>
+          <w:rFonts w:ascii="Ink Journal" w:hAnsi="Ink Journal"/>
+        </w:rPr>
+        <w:t>.</w:t>
       </w:r>
     </w:p>
     <w:p>
       <w:pPr>
-        <w:pStyle w:val="ListParagraph"/>
-      </w:pPr>
+        <w:pStyle w:val="Heading1"/>
+        <w:spacing w:line="480" w:lineRule="auto"/>
+        <w:rPr>
+          <w:rFonts w:ascii="Ink Journal" w:hAnsi="Ink Journal"/>
+          <w:color w:val="47D459" w:themeColor="accent3" w:themeTint="99"/>
+          <w:sz w:val="24"/>
+          <w:szCs w:val="24"/>
+        </w:rPr>
+      </w:pPr>
+      <w:r>
+        <w:rPr>
+          <w:rFonts w:ascii="Ink Journal" w:hAnsi="Ink Journal"/>
+          <w:color w:val="47D459" w:themeColor="accent3" w:themeTint="99"/>
+          <w:sz w:val="24"/>
+          <w:szCs w:val="24"/>
+        </w:rPr>
+        <w:t>Core stage</w:t>
+      </w:r>
     </w:p>
     <w:p>
       <w:pPr>
-        <w:pStyle w:val="Heading1"/>
-        <w:rPr>
-          <w:rFonts w:ascii="Ink Journal" w:hAnsi="Ink Journal"/>
-          <w:color w:val="47D459" w:themeColor="accent3" w:themeTint="99"/>
-          <w:sz w:val="22"/>
-          <w:szCs w:val="22"/>
-        </w:rPr>
-      </w:pPr>
-      <w:r>
-        <w:rPr>
-          <w:rFonts w:ascii="Ink Journal" w:hAnsi="Ink Journal"/>
-          <w:color w:val="47D459" w:themeColor="accent3" w:themeTint="99"/>
-          <w:sz w:val="22"/>
-          <w:szCs w:val="22"/>
-        </w:rPr>
-        <w:t>C</w:t>
-      </w:r>
-      <w:r>
-        <w:rPr>
-          <w:rFonts w:ascii="Ink Journal" w:hAnsi="Ink Journal"/>
-          <w:color w:val="47D459" w:themeColor="accent3" w:themeTint="99"/>
-          <w:sz w:val="22"/>
-          <w:szCs w:val="22"/>
-        </w:rPr>
-        <w:t>ore stage</w:t>
-      </w:r>
-    </w:p>
-    <w:p>
-      <w:pPr>
+        <w:spacing w:line="480" w:lineRule="auto"/>
         <w:ind w:left="360"/>
         <w:rPr>
           <w:rFonts w:ascii="Ink Journal" w:hAnsi="Ink Journal"/>
-          <w:sz w:val="22"/>
-          <w:szCs w:val="22"/>
-        </w:rPr>
-      </w:pPr>
-      <w:r>
-        <w:rPr>
-          <w:rFonts w:ascii="Ink Journal" w:hAnsi="Ink Journal"/>
-          <w:sz w:val="22"/>
-          <w:szCs w:val="22"/>
-        </w:rPr>
-        <w:t xml:space="preserve">Noticed that the </w:t>
-      </w:r>
-      <w:proofErr w:type="spellStart"/>
-      <w:r>
-        <w:rPr>
-          <w:rFonts w:ascii="Ink Journal" w:hAnsi="Ink Journal"/>
-          <w:sz w:val="22"/>
-          <w:szCs w:val="22"/>
-        </w:rPr>
-        <w:t>order_zipcode</w:t>
-      </w:r>
-      <w:proofErr w:type="spellEnd"/>
-      <w:r>
-        <w:rPr>
-          <w:rFonts w:ascii="Ink Journal" w:hAnsi="Ink Journal"/>
-          <w:sz w:val="22"/>
-          <w:szCs w:val="22"/>
-        </w:rPr>
-        <w:t xml:space="preserve"> was null from the source. The following steps were taken to clean it up</w:t>
-      </w:r>
-      <w:r>
-        <w:rPr>
-          <w:rFonts w:ascii="Ink Journal" w:hAnsi="Ink Journal"/>
-          <w:sz w:val="22"/>
-          <w:szCs w:val="22"/>
-        </w:rPr>
-        <w:t>:</w:t>
+        </w:rPr>
+      </w:pPr>
+      <w:r>
+        <w:rPr>
+          <w:rFonts w:ascii="Ink Journal" w:hAnsi="Ink Journal"/>
+        </w:rPr>
+        <w:t>Noticed that the order_zipcode was null from the source. The following steps were taken to clean it up:</w:t>
       </w:r>
     </w:p>
     <w:p>
@@ -504,17 +281,14 @@
           <w:ilvl w:val="0"/>
           <w:numId w:val="8"/>
         </w:numPr>
-        <w:rPr>
-          <w:rFonts w:ascii="Ink Journal" w:hAnsi="Ink Journal"/>
-          <w:sz w:val="22"/>
-          <w:szCs w:val="22"/>
-        </w:rPr>
-      </w:pPr>
-      <w:r>
-        <w:rPr>
-          <w:rFonts w:ascii="Ink Journal" w:hAnsi="Ink Journal"/>
-          <w:sz w:val="22"/>
-          <w:szCs w:val="22"/>
+        <w:spacing w:line="480" w:lineRule="auto"/>
+        <w:rPr>
+          <w:rFonts w:ascii="Ink Journal" w:hAnsi="Ink Journal"/>
+        </w:rPr>
+      </w:pPr>
+      <w:r>
+        <w:rPr>
+          <w:rFonts w:ascii="Ink Journal" w:hAnsi="Ink Journal"/>
         </w:rPr>
         <w:t>Truncate the fact table and the dimension table</w:t>
       </w:r>
@@ -526,17 +300,14 @@
           <w:ilvl w:val="0"/>
           <w:numId w:val="8"/>
         </w:numPr>
-        <w:rPr>
-          <w:rFonts w:ascii="Ink Journal" w:hAnsi="Ink Journal"/>
-          <w:sz w:val="22"/>
-          <w:szCs w:val="22"/>
-        </w:rPr>
-      </w:pPr>
-      <w:r>
-        <w:rPr>
-          <w:rFonts w:ascii="Ink Journal" w:hAnsi="Ink Journal"/>
-          <w:sz w:val="22"/>
-          <w:szCs w:val="22"/>
+        <w:spacing w:line="480" w:lineRule="auto"/>
+        <w:rPr>
+          <w:rFonts w:ascii="Ink Journal" w:hAnsi="Ink Journal"/>
+        </w:rPr>
+      </w:pPr>
+      <w:r>
+        <w:rPr>
+          <w:rFonts w:ascii="Ink Journal" w:hAnsi="Ink Journal"/>
         </w:rPr>
         <w:t>reload dimension table, added the constraints</w:t>
       </w:r>
@@ -548,25 +319,20 @@
           <w:ilvl w:val="0"/>
           <w:numId w:val="8"/>
         </w:numPr>
-        <w:rPr>
-          <w:rFonts w:ascii="Ink Journal" w:hAnsi="Ink Journal"/>
-          <w:sz w:val="22"/>
-          <w:szCs w:val="22"/>
-        </w:rPr>
-      </w:pPr>
-      <w:r>
-        <w:rPr>
-          <w:rFonts w:ascii="Ink Journal" w:hAnsi="Ink Journal"/>
-          <w:sz w:val="22"/>
-          <w:szCs w:val="22"/>
+        <w:spacing w:line="480" w:lineRule="auto"/>
+        <w:rPr>
+          <w:rFonts w:ascii="Ink Journal" w:hAnsi="Ink Journal"/>
+        </w:rPr>
+      </w:pPr>
+      <w:r>
+        <w:rPr>
+          <w:rFonts w:ascii="Ink Journal" w:hAnsi="Ink Journal"/>
         </w:rPr>
         <w:t>Reload the fact table.</w:t>
       </w:r>
       <w:r>
         <w:rPr>
           <w:rFonts w:ascii="Ink Journal" w:hAnsi="Ink Journal"/>
-          <w:sz w:val="22"/>
-          <w:szCs w:val="22"/>
         </w:rPr>
         <w:br/>
         <w:t xml:space="preserve">    </w:t>
@@ -574,15 +340,188 @@
     </w:p>
     <w:p>
       <w:pPr>
-        <w:pStyle w:val="ListParagraph"/>
-      </w:pPr>
+        <w:pStyle w:val="Heading1"/>
+        <w:spacing w:line="480" w:lineRule="auto"/>
+        <w:rPr>
+          <w:rFonts w:ascii="Ink Journal" w:hAnsi="Ink Journal"/>
+          <w:color w:val="47D459" w:themeColor="accent3" w:themeTint="99"/>
+          <w:sz w:val="24"/>
+          <w:szCs w:val="24"/>
+        </w:rPr>
+      </w:pPr>
+      <w:r>
+        <w:rPr>
+          <w:rFonts w:ascii="Ink Journal" w:hAnsi="Ink Journal"/>
+          <w:color w:val="47D459" w:themeColor="accent3" w:themeTint="99"/>
+          <w:sz w:val="24"/>
+          <w:szCs w:val="24"/>
+        </w:rPr>
+        <w:lastRenderedPageBreak/>
+        <w:t>Supply Chain &amp; Sales Performance Analytics</w:t>
+      </w:r>
     </w:p>
     <w:p>
       <w:pPr>
-        <w:rPr>
-          <w:rFonts w:ascii="Ink Journal" w:hAnsi="Ink Journal"/>
-          <w:sz w:val="22"/>
-          <w:szCs w:val="22"/>
+        <w:pStyle w:val="ListParagraph"/>
+        <w:numPr>
+          <w:ilvl w:val="0"/>
+          <w:numId w:val="8"/>
+        </w:numPr>
+        <w:spacing w:line="480" w:lineRule="auto"/>
+        <w:rPr>
+          <w:rFonts w:ascii="Ink Journal" w:hAnsi="Ink Journal"/>
+        </w:rPr>
+      </w:pPr>
+      <w:r>
+        <w:rPr>
+          <w:rFonts w:ascii="Ink Journal" w:hAnsi="Ink Journal"/>
+        </w:rPr>
+        <w:t>And execute it in this order:</w:t>
+      </w:r>
+    </w:p>
+    <w:p>
+      <w:pPr>
+        <w:pStyle w:val="ListParagraph"/>
+        <w:numPr>
+          <w:ilvl w:val="0"/>
+          <w:numId w:val="8"/>
+        </w:numPr>
+        <w:spacing w:line="480" w:lineRule="auto"/>
+        <w:rPr>
+          <w:rFonts w:ascii="Ink Journal" w:hAnsi="Ink Journal"/>
+        </w:rPr>
+      </w:pPr>
+      <w:r>
+        <w:rPr>
+          <w:rFonts w:ascii="Ink Journal" w:hAnsi="Ink Journal"/>
+        </w:rPr>
+        <w:t xml:space="preserve">KPI analysis </w:t>
+      </w:r>
+    </w:p>
+    <w:p>
+      <w:pPr>
+        <w:pStyle w:val="ListParagraph"/>
+        <w:numPr>
+          <w:ilvl w:val="0"/>
+          <w:numId w:val="8"/>
+        </w:numPr>
+        <w:spacing w:line="480" w:lineRule="auto"/>
+        <w:rPr>
+          <w:rFonts w:ascii="Ink Journal" w:hAnsi="Ink Journal"/>
+        </w:rPr>
+      </w:pPr>
+      <w:r>
+        <w:rPr>
+          <w:rFonts w:ascii="Ink Journal" w:hAnsi="Ink Journal"/>
+        </w:rPr>
+        <w:t xml:space="preserve">product analysis </w:t>
+      </w:r>
+    </w:p>
+    <w:p>
+      <w:pPr>
+        <w:pStyle w:val="ListParagraph"/>
+        <w:numPr>
+          <w:ilvl w:val="0"/>
+          <w:numId w:val="8"/>
+        </w:numPr>
+        <w:spacing w:line="480" w:lineRule="auto"/>
+        <w:rPr>
+          <w:rFonts w:ascii="Ink Journal" w:hAnsi="Ink Journal"/>
+        </w:rPr>
+      </w:pPr>
+      <w:r>
+        <w:rPr>
+          <w:rFonts w:ascii="Ink Journal" w:hAnsi="Ink Journal"/>
+        </w:rPr>
+        <w:t xml:space="preserve">customer analysis </w:t>
+      </w:r>
+    </w:p>
+    <w:p>
+      <w:pPr>
+        <w:pStyle w:val="ListParagraph"/>
+        <w:numPr>
+          <w:ilvl w:val="0"/>
+          <w:numId w:val="8"/>
+        </w:numPr>
+        <w:spacing w:line="480" w:lineRule="auto"/>
+        <w:rPr>
+          <w:rFonts w:ascii="Ink Journal" w:hAnsi="Ink Journal"/>
+        </w:rPr>
+      </w:pPr>
+      <w:r>
+        <w:rPr>
+          <w:rFonts w:ascii="Ink Journal" w:hAnsi="Ink Journal"/>
+        </w:rPr>
+        <w:t xml:space="preserve">delivery analysis </w:t>
+      </w:r>
+    </w:p>
+    <w:p>
+      <w:pPr>
+        <w:pStyle w:val="ListParagraph"/>
+        <w:numPr>
+          <w:ilvl w:val="0"/>
+          <w:numId w:val="8"/>
+        </w:numPr>
+        <w:spacing w:line="480" w:lineRule="auto"/>
+        <w:rPr>
+          <w:rFonts w:ascii="Ink Journal" w:hAnsi="Ink Journal"/>
+        </w:rPr>
+      </w:pPr>
+      <w:r>
+        <w:rPr>
+          <w:rFonts w:ascii="Ink Journal" w:hAnsi="Ink Journal"/>
+        </w:rPr>
+        <w:t xml:space="preserve">geographic analysis </w:t>
+      </w:r>
+    </w:p>
+    <w:p>
+      <w:pPr>
+        <w:pStyle w:val="ListParagraph"/>
+        <w:numPr>
+          <w:ilvl w:val="0"/>
+          <w:numId w:val="8"/>
+        </w:numPr>
+        <w:spacing w:line="480" w:lineRule="auto"/>
+        <w:rPr>
+          <w:rFonts w:ascii="Ink Journal" w:hAnsi="Ink Journal"/>
+        </w:rPr>
+      </w:pPr>
+      <w:r>
+        <w:rPr>
+          <w:rFonts w:ascii="Ink Journal" w:hAnsi="Ink Journal"/>
+        </w:rPr>
+        <w:t xml:space="preserve">time analysis </w:t>
+      </w:r>
+    </w:p>
+    <w:p>
+      <w:pPr>
+        <w:pStyle w:val="ListParagraph"/>
+        <w:numPr>
+          <w:ilvl w:val="0"/>
+          <w:numId w:val="8"/>
+        </w:numPr>
+        <w:spacing w:line="480" w:lineRule="auto"/>
+        <w:rPr>
+          <w:rFonts w:ascii="Ink Journal" w:hAnsi="Ink Journal"/>
+        </w:rPr>
+      </w:pPr>
+      <w:r>
+        <w:rPr>
+          <w:rFonts w:ascii="Ink Journal" w:hAnsi="Ink Journal"/>
+        </w:rPr>
+        <w:t>Power BI dashboard</w:t>
+      </w:r>
+    </w:p>
+    <w:p>
+      <w:pPr>
+        <w:spacing w:line="480" w:lineRule="auto"/>
+      </w:pPr>
+    </w:p>
+    <w:p>
+      <w:pPr>
+        <w:spacing w:line="480" w:lineRule="auto"/>
+        <w:rPr>
+          <w:rFonts w:ascii="Ink Journal" w:hAnsi="Ink Journal"/>
         </w:rPr>
       </w:pPr>
     </w:p>
@@ -1368,6 +1307,119 @@
       <w:rPr>
         <w:rFonts w:ascii="Wingdings" w:hAnsi="Wingdings" w:hint="default"/>
       </w:rPr>
+    </w:lvl>
+  </w:abstractNum>
+  <w:abstractNum w:abstractNumId="8" w15:restartNumberingAfterBreak="0">
+    <w:nsid w:val="7E41453B"/>
+    <w:multiLevelType w:val="multilevel"/>
+    <w:tmpl w:val="407090C2"/>
+    <w:lvl w:ilvl="0">
+      <w:start w:val="1"/>
+      <w:numFmt w:val="decimal"/>
+      <w:lvlText w:val="%1."/>
+      <w:lvlJc w:val="left"/>
+      <w:pPr>
+        <w:tabs>
+          <w:tab w:val="num" w:pos="720"/>
+        </w:tabs>
+        <w:ind w:left="720" w:hanging="360"/>
+      </w:pPr>
+    </w:lvl>
+    <w:lvl w:ilvl="1" w:tentative="1">
+      <w:start w:val="1"/>
+      <w:numFmt w:val="decimal"/>
+      <w:lvlText w:val="%2."/>
+      <w:lvlJc w:val="left"/>
+      <w:pPr>
+        <w:tabs>
+          <w:tab w:val="num" w:pos="1440"/>
+        </w:tabs>
+        <w:ind w:left="1440" w:hanging="360"/>
+      </w:pPr>
+    </w:lvl>
+    <w:lvl w:ilvl="2" w:tentative="1">
+      <w:start w:val="1"/>
+      <w:numFmt w:val="decimal"/>
+      <w:lvlText w:val="%3."/>
+      <w:lvlJc w:val="left"/>
+      <w:pPr>
+        <w:tabs>
+          <w:tab w:val="num" w:pos="2160"/>
+        </w:tabs>
+        <w:ind w:left="2160" w:hanging="360"/>
+      </w:pPr>
+    </w:lvl>
+    <w:lvl w:ilvl="3" w:tentative="1">
+      <w:start w:val="1"/>
+      <w:numFmt w:val="decimal"/>
+      <w:lvlText w:val="%4."/>
+      <w:lvlJc w:val="left"/>
+      <w:pPr>
+        <w:tabs>
+          <w:tab w:val="num" w:pos="2880"/>
+        </w:tabs>
+        <w:ind w:left="2880" w:hanging="360"/>
+      </w:pPr>
+    </w:lvl>
+    <w:lvl w:ilvl="4" w:tentative="1">
+      <w:start w:val="1"/>
+      <w:numFmt w:val="decimal"/>
+      <w:lvlText w:val="%5."/>
+      <w:lvlJc w:val="left"/>
+      <w:pPr>
+        <w:tabs>
+          <w:tab w:val="num" w:pos="3600"/>
+        </w:tabs>
+        <w:ind w:left="3600" w:hanging="360"/>
+      </w:pPr>
+    </w:lvl>
+    <w:lvl w:ilvl="5" w:tentative="1">
+      <w:start w:val="1"/>
+      <w:numFmt w:val="decimal"/>
+      <w:lvlText w:val="%6."/>
+      <w:lvlJc w:val="left"/>
+      <w:pPr>
+        <w:tabs>
+          <w:tab w:val="num" w:pos="4320"/>
+        </w:tabs>
+        <w:ind w:left="4320" w:hanging="360"/>
+      </w:pPr>
+    </w:lvl>
+    <w:lvl w:ilvl="6" w:tentative="1">
+      <w:start w:val="1"/>
+      <w:numFmt w:val="decimal"/>
+      <w:lvlText w:val="%7."/>
+      <w:lvlJc w:val="left"/>
+      <w:pPr>
+        <w:tabs>
+          <w:tab w:val="num" w:pos="5040"/>
+        </w:tabs>
+        <w:ind w:left="5040" w:hanging="360"/>
+      </w:pPr>
+    </w:lvl>
+    <w:lvl w:ilvl="7" w:tentative="1">
+      <w:start w:val="1"/>
+      <w:numFmt w:val="decimal"/>
+      <w:lvlText w:val="%8."/>
+      <w:lvlJc w:val="left"/>
+      <w:pPr>
+        <w:tabs>
+          <w:tab w:val="num" w:pos="5760"/>
+        </w:tabs>
+        <w:ind w:left="5760" w:hanging="360"/>
+      </w:pPr>
+    </w:lvl>
+    <w:lvl w:ilvl="8" w:tentative="1">
+      <w:start w:val="1"/>
+      <w:numFmt w:val="decimal"/>
+      <w:lvlText w:val="%9."/>
+      <w:lvlJc w:val="left"/>
+      <w:pPr>
+        <w:tabs>
+          <w:tab w:val="num" w:pos="6480"/>
+        </w:tabs>
+        <w:ind w:left="6480" w:hanging="360"/>
+      </w:pPr>
     </w:lvl>
   </w:abstractNum>
   <w:num w:numId="1" w16cid:durableId="200634869">
@@ -1393,6 +1445,9 @@
   </w:num>
   <w:num w:numId="8" w16cid:durableId="948507738">
     <w:abstractNumId w:val="7"/>
+  </w:num>
+  <w:num w:numId="9" w16cid:durableId="2146895277">
+    <w:abstractNumId w:val="8"/>
   </w:num>
 </w:numbering>
 </file>
@@ -2000,7 +2055,6 @@
   <w:style w:type="character" w:default="1" w:styleId="DefaultParagraphFont">
     <w:name w:val="Default Paragraph Font"/>
     <w:uiPriority w:val="1"/>
-    <w:semiHidden/>
     <w:unhideWhenUsed/>
   </w:style>
   <w:style w:type="table" w:default="1" w:styleId="TableNormal">

</xml_diff>